<commit_message>
Lesson 6 report editted and presentation added to repo
</commit_message>
<xml_diff>
--- a/Lesson6/Lesson6Report.docx
+++ b/Lesson6/Lesson6Report.docx
@@ -170,51 +170,21 @@
         <w:rPr>
           <w:color w:val="215E99" w:themeColor="text2" w:themeTint="BF"/>
         </w:rPr>
-        <w:t>1</w:t>
-      </w:r>
-      <w:r>
+        <w:t>15-4-2026</w:t>
+      </w:r>
+    </w:p>
+    <w:p>
+      <w:pPr>
+        <w:jc w:val="center"/>
         <w:rPr>
           <w:color w:val="215E99" w:themeColor="text2" w:themeTint="BF"/>
         </w:rPr>
-        <w:t>5</w:t>
-      </w:r>
+      </w:pPr>
       <w:r>
         <w:rPr>
           <w:color w:val="215E99" w:themeColor="text2" w:themeTint="BF"/>
         </w:rPr>
-        <w:t>-4-2026</w:t>
-      </w:r>
-    </w:p>
-    <w:p>
-      <w:pPr>
-        <w:jc w:val="center"/>
-        <w:rPr>
-          <w:color w:val="215E99" w:themeColor="text2" w:themeTint="BF"/>
-        </w:rPr>
-      </w:pPr>
-      <w:r>
-        <w:rPr>
-          <w:color w:val="215E99" w:themeColor="text2" w:themeTint="BF"/>
-        </w:rPr>
-        <w:t xml:space="preserve">Lesson </w:t>
-      </w:r>
-      <w:r>
-        <w:rPr>
-          <w:color w:val="215E99" w:themeColor="text2" w:themeTint="BF"/>
-        </w:rPr>
-        <w:t>6</w:t>
-      </w:r>
-      <w:r>
-        <w:rPr>
-          <w:color w:val="215E99" w:themeColor="text2" w:themeTint="BF"/>
-        </w:rPr>
-        <w:t xml:space="preserve">: </w:t>
-      </w:r>
-      <w:r>
-        <w:rPr>
-          <w:color w:val="215E99" w:themeColor="text2" w:themeTint="BF"/>
-        </w:rPr>
-        <w:t>DOS Attack</w:t>
+        <w:t>Lesson 6: DOS Attack</w:t>
       </w:r>
     </w:p>
     <w:p>
@@ -1204,6 +1174,7 @@
           <w:rFonts w:ascii="Times New Roman" w:eastAsia="Times New Roman" w:hAnsi="Times New Roman" w:cs="Times New Roman"/>
           <w:b/>
           <w:bCs/>
+          <w:noProof/>
           <w:kern w:val="0"/>
           <w:lang w:val="en-SA"/>
           <w14:ligatures w14:val="none"/>
@@ -1260,6 +1231,7 @@
           <w:rFonts w:ascii="Times New Roman" w:eastAsia="Times New Roman" w:hAnsi="Times New Roman" w:cs="Times New Roman"/>
           <w:b/>
           <w:bCs/>
+          <w:noProof/>
           <w:kern w:val="0"/>
           <w:lang w:val="en-SA"/>
           <w14:ligatures w14:val="none"/>
@@ -1314,6 +1286,7 @@
       <w:r>
         <w:rPr>
           <w:rFonts w:ascii="Times New Roman" w:eastAsia="Times New Roman" w:hAnsi="Times New Roman" w:cs="Times New Roman"/>
+          <w:noProof/>
           <w:kern w:val="0"/>
           <w:lang w:val="en-SA"/>
           <w14:ligatures w14:val="none"/>
@@ -1838,6 +1811,60 @@
     </w:p>
     <w:p>
       <w:pPr>
+        <w:spacing w:before="100" w:beforeAutospacing="1" w:after="100" w:afterAutospacing="1" w:line="240" w:lineRule="auto"/>
+        <w:rPr>
+          <w:rFonts w:ascii="Times New Roman" w:eastAsia="Times New Roman" w:hAnsi="Times New Roman" w:cs="Times New Roman"/>
+          <w:kern w:val="0"/>
+          <w:lang w:val="en-SA"/>
+          <w14:ligatures w14:val="none"/>
+        </w:rPr>
+      </w:pPr>
+      <w:r>
+        <w:rPr>
+          <w:rFonts w:ascii="Times New Roman" w:eastAsia="Times New Roman" w:hAnsi="Times New Roman" w:cs="Times New Roman"/>
+          <w:kern w:val="0"/>
+          <w:lang w:val="en-SA"/>
+          <w14:ligatures w14:val="none"/>
+        </w:rPr>
+        <w:drawing>
+          <wp:inline distT="0" distB="0" distL="0" distR="0" wp14:anchorId="37B9A4D4" wp14:editId="67F530E8">
+            <wp:extent cx="4610100" cy="2336800"/>
+            <wp:effectExtent l="0" t="0" r="0" b="0"/>
+            <wp:docPr id="1446705844" name="Picture 1"/>
+            <wp:cNvGraphicFramePr>
+              <a:graphicFrameLocks xmlns:a="http://schemas.openxmlformats.org/drawingml/2006/main" noChangeAspect="1"/>
+            </wp:cNvGraphicFramePr>
+            <a:graphic xmlns:a="http://schemas.openxmlformats.org/drawingml/2006/main">
+              <a:graphicData uri="http://schemas.openxmlformats.org/drawingml/2006/picture">
+                <pic:pic xmlns:pic="http://schemas.openxmlformats.org/drawingml/2006/picture">
+                  <pic:nvPicPr>
+                    <pic:cNvPr id="1446705844" name=""/>
+                    <pic:cNvPicPr/>
+                  </pic:nvPicPr>
+                  <pic:blipFill>
+                    <a:blip r:embed="rId10"/>
+                    <a:stretch>
+                      <a:fillRect/>
+                    </a:stretch>
+                  </pic:blipFill>
+                  <pic:spPr>
+                    <a:xfrm>
+                      <a:off x="0" y="0"/>
+                      <a:ext cx="4610100" cy="2336800"/>
+                    </a:xfrm>
+                    <a:prstGeom prst="rect">
+                      <a:avLst/>
+                    </a:prstGeom>
+                  </pic:spPr>
+                </pic:pic>
+              </a:graphicData>
+            </a:graphic>
+          </wp:inline>
+        </w:drawing>
+      </w:r>
+    </w:p>
+    <w:p>
+      <w:pPr>
         <w:spacing w:after="0" w:line="240" w:lineRule="auto"/>
         <w:rPr>
           <w:rFonts w:ascii="Times New Roman" w:eastAsia="Times New Roman" w:hAnsi="Times New Roman" w:cs="Times New Roman"/>
@@ -1889,6 +1916,7 @@
           <w:lang w:val="en-SA"/>
           <w14:ligatures w14:val="none"/>
         </w:rPr>
+        <w:lastRenderedPageBreak/>
         <w:t>Structured Operation and Security Analysis</w:t>
       </w:r>
     </w:p>
@@ -1991,7 +2019,6 @@
           <w:lang w:val="en-SA"/>
           <w14:ligatures w14:val="none"/>
         </w:rPr>
-        <w:lastRenderedPageBreak/>
         <w:t>The main security rules are:</w:t>
       </w:r>
     </w:p>
@@ -2366,6 +2393,7 @@
           <w:lang w:val="en-SA"/>
           <w14:ligatures w14:val="none"/>
         </w:rPr>
+        <w:lastRenderedPageBreak/>
         <w:t>The exploit behavior deviates from intended system design by allowing a single actor to exhaust backend resources.This results in denial of service for legitimate users.</w:t>
       </w:r>
     </w:p>
@@ -2488,7 +2516,6 @@
           <w:lang w:val="en-SA"/>
           <w14:ligatures w14:val="none"/>
         </w:rPr>
-        <w:lastRenderedPageBreak/>
         <w:t>The incorrect assumption in the system was that limiting concurrency at the infrastructure level alone is sufficient.</w:t>
       </w:r>
       <w:r>
@@ -3107,7 +3134,17 @@
                 <w:lang w:val="en-SA"/>
                 <w14:ligatures w14:val="none"/>
               </w:rPr>
-              <w:t xml:space="preserve"> System allows resource exhaustion through uncontrolled parallel requests </w:t>
+              <w:t xml:space="preserve"> System allows resource exhaustion through </w:t>
+            </w:r>
+            <w:r>
+              <w:rPr>
+                <w:rFonts w:ascii="Times New Roman" w:eastAsia="Times New Roman" w:hAnsi="Times New Roman" w:cs="Times New Roman"/>
+                <w:kern w:val="0"/>
+                <w:lang w:val="en-SA"/>
+                <w14:ligatures w14:val="none"/>
+              </w:rPr>
+              <w:lastRenderedPageBreak/>
+              <w:t xml:space="preserve">uncontrolled parallel requests </w:t>
             </w:r>
           </w:p>
         </w:tc>
@@ -3132,6 +3169,7 @@
                 <w:lang w:val="en-SA"/>
                 <w14:ligatures w14:val="none"/>
               </w:rPr>
+              <w:lastRenderedPageBreak/>
               <w:t xml:space="preserve"> Intentional misuse / resource exhaustion </w:t>
             </w:r>
           </w:p>
@@ -3157,7 +3195,17 @@
                 <w:lang w:val="en-SA"/>
                 <w14:ligatures w14:val="none"/>
               </w:rPr>
-              <w:t xml:space="preserve"> Applied API Gateway throttling and Lambda concurrency controls </w:t>
+              <w:t xml:space="preserve"> Applied API Gateway throttling and Lambda </w:t>
+            </w:r>
+            <w:r>
+              <w:rPr>
+                <w:rFonts w:ascii="Times New Roman" w:eastAsia="Times New Roman" w:hAnsi="Times New Roman" w:cs="Times New Roman"/>
+                <w:kern w:val="0"/>
+                <w:lang w:val="en-SA"/>
+                <w14:ligatures w14:val="none"/>
+              </w:rPr>
+              <w:lastRenderedPageBreak/>
+              <w:t xml:space="preserve">concurrency controls </w:t>
             </w:r>
           </w:p>
         </w:tc>
@@ -3182,7 +3230,18 @@
                 <w:lang w:val="en-SA"/>
                 <w14:ligatures w14:val="none"/>
               </w:rPr>
-              <w:t xml:space="preserve"> After fix, excessive requests are throttled and normal requests succeed</w:t>
+              <w:lastRenderedPageBreak/>
+              <w:t xml:space="preserve"> After fix, excessive requests are throttled and </w:t>
+            </w:r>
+            <w:r>
+              <w:rPr>
+                <w:rFonts w:ascii="Times New Roman" w:eastAsia="Times New Roman" w:hAnsi="Times New Roman" w:cs="Times New Roman"/>
+                <w:kern w:val="0"/>
+                <w:lang w:val="en-SA"/>
+                <w14:ligatures w14:val="none"/>
+              </w:rPr>
+              <w:lastRenderedPageBreak/>
+              <w:t>normal requests succeed</w:t>
             </w:r>
           </w:p>
         </w:tc>
@@ -3205,6 +3264,7 @@
           <w:kern w:val="0"/>
           <w:lang w:val="en-SA"/>
         </w:rPr>
+        <w:lastRenderedPageBreak/>
         <w:pict w14:anchorId="1E1CC8AD">
           <v:rect id="_x0000_i1025" alt="" style="width:468pt;height:.05pt;mso-width-percent:0;mso-height-percent:0;mso-width-percent:0;mso-height-percent:0" o:hralign="center" o:hrstd="t" o:hr="t" fillcolor="#a0a0a0" stroked="f"/>
         </w:pict>
@@ -3313,7 +3373,6 @@
           <w:lang w:val="en-SA"/>
           <w14:ligatures w14:val="none"/>
         </w:rPr>
-        <w:lastRenderedPageBreak/>
         <w:t>Takeaway / Lessons Learned</w:t>
       </w:r>
     </w:p>

</xml_diff>